<commit_message>
Remove AVAC price ranges from the anonymised diagnostic report
Co-Authored-By: Claude Opus 5.5 <noreply@anthropic.com>
Claude-Session: https://claude.ai/code/session_013F3bb4ix2DfWvuNVcmYkcc
</commit_message>
<xml_diff>
--- a/reports/oil-palm-processor-diagnostic-report-anonymised.docx
+++ b/reports/oil-palm-processor-diagnostic-report-anonymised.docx
@@ -6173,7 +6173,7 @@
           <w:sz w:val="21"/>
           <w:szCs w:val="21"/>
         </w:rPr>
-        <w:t xml:space="preserve">This pilot was provided at no charge. The work below is the paid continuation; each item is priced independently.</w:t>
+        <w:t xml:space="preserve">This pilot was provided at no charge. The work below is the paid continuation; each item is scoped and quoted separately.</w:t>
       </w:r>
     </w:p>
     <w:tbl>
@@ -6189,9 +6189,8 @@
         </w:tblBorders>
       </w:tblPr>
       <w:tblGrid>
-        <w:gridCol w:w="2600"/>
-        <w:gridCol w:w="4626"/>
-        <w:gridCol w:w="1800"/>
+        <w:gridCol w:w="3000"/>
+        <w:gridCol w:w="6026"/>
       </w:tblGrid>
       <w:tr>
         <w:trPr>
@@ -6199,7 +6198,7 @@
         </w:trPr>
         <w:tc>
           <w:tcPr>
-            <w:tcW w:type="dxa" w:w="2600"/>
+            <w:tcW w:type="dxa" w:w="3000"/>
             <w:tcBorders>
               <w:top w:val="single" w:color="BFBFBF" w:sz="4"/>
               <w:left w:val="single" w:color="BFBFBF" w:sz="4"/>
@@ -6230,7 +6229,7 @@
         </w:tc>
         <w:tc>
           <w:tcPr>
-            <w:tcW w:type="dxa" w:w="4626"/>
+            <w:tcW w:type="dxa" w:w="6026"/>
             <w:tcBorders>
               <w:top w:val="single" w:color="BFBFBF" w:sz="4"/>
               <w:left w:val="single" w:color="BFBFBF" w:sz="4"/>
@@ -6259,37 +6258,6 @@
             </w:r>
           </w:p>
         </w:tc>
-        <w:tc>
-          <w:tcPr>
-            <w:tcW w:type="dxa" w:w="1800"/>
-            <w:tcBorders>
-              <w:top w:val="single" w:color="BFBFBF" w:sz="4"/>
-              <w:left w:val="single" w:color="BFBFBF" w:sz="4"/>
-              <w:bottom w:val="single" w:color="BFBFBF" w:sz="4"/>
-              <w:right w:val="single" w:color="BFBFBF" w:sz="4"/>
-            </w:tcBorders>
-            <w:shd w:fill="1F5E3B" w:color="auto" w:val="clear"/>
-            <w:tcMar>
-              <w:top w:type="dxa" w:w="70"/>
-              <w:left w:type="dxa" w:w="110"/>
-              <w:bottom w:type="dxa" w:w="70"/>
-              <w:right w:type="dxa" w:w="110"/>
-            </w:tcMar>
-          </w:tcPr>
-          <w:p>
-            <w:r>
-              <w:rPr>
-                <w:rFonts w:ascii="Montserrat" w:cs="Montserrat" w:eastAsia="Montserrat" w:hAnsi="Montserrat"/>
-                <w:b/>
-                <w:bCs/>
-                <w:color w:val="FFFFFF"/>
-                <w:sz w:val="17"/>
-                <w:szCs w:val="17"/>
-              </w:rPr>
-              <w:t xml:space="preserve">Indicative range (GHS)</w:t>
-            </w:r>
-          </w:p>
-        </w:tc>
       </w:tr>
       <w:tr>
         <w:trPr>
@@ -6297,7 +6265,7 @@
         </w:trPr>
         <w:tc>
           <w:tcPr>
-            <w:tcW w:type="dxa" w:w="2600"/>
+            <w:tcW w:type="dxa" w:w="3000"/>
             <w:tcBorders>
               <w:top w:val="single" w:color="BFBFBF" w:sz="4"/>
               <w:left w:val="single" w:color="BFBFBF" w:sz="4"/>
@@ -6327,7 +6295,7 @@
         </w:tc>
         <w:tc>
           <w:tcPr>
-            <w:tcW w:type="dxa" w:w="4626"/>
+            <w:tcW w:type="dxa" w:w="6026"/>
             <w:tcBorders>
               <w:top w:val="single" w:color="BFBFBF" w:sz="4"/>
               <w:left w:val="single" w:color="BFBFBF" w:sz="4"/>
@@ -6352,36 +6320,6 @@
                 <w:szCs w:val="19"/>
               </w:rPr>
               <w:t xml:space="preserve">Verification of Findings 4 to 7 on site; installation of the costing system (R1), production record system (R2) and management account pack (R6); governance and role definition</w:t>
-            </w:r>
-          </w:p>
-        </w:tc>
-        <w:tc>
-          <w:tcPr>
-            <w:tcW w:type="dxa" w:w="1800"/>
-            <w:tcBorders>
-              <w:top w:val="single" w:color="BFBFBF" w:sz="4"/>
-              <w:left w:val="single" w:color="BFBFBF" w:sz="4"/>
-              <w:bottom w:val="single" w:color="BFBFBF" w:sz="4"/>
-              <w:right w:val="single" w:color="BFBFBF" w:sz="4"/>
-            </w:tcBorders>
-            <w:tcMar>
-              <w:top w:type="dxa" w:w="70"/>
-              <w:left w:type="dxa" w:w="110"/>
-              <w:bottom w:type="dxa" w:w="70"/>
-              <w:right w:type="dxa" w:w="110"/>
-            </w:tcMar>
-          </w:tcPr>
-          <w:p>
-            <w:r>
-              <w:rPr>
-                <w:rFonts w:ascii="Open Sans" w:cs="Open Sans" w:eastAsia="Open Sans" w:hAnsi="Open Sans"/>
-                <w:b w:val="false"/>
-                <w:bCs w:val="false"/>
-                <w:color w:val="222222"/>
-                <w:sz w:val="19"/>
-                <w:szCs w:val="19"/>
-              </w:rPr>
-              <w:t xml:space="preserve">12,000 – 35,000</w:t>
             </w:r>
           </w:p>
         </w:tc>
@@ -6392,7 +6330,7 @@
         </w:trPr>
         <w:tc>
           <w:tcPr>
-            <w:tcW w:type="dxa" w:w="2600"/>
+            <w:tcW w:type="dxa" w:w="3000"/>
             <w:tcBorders>
               <w:top w:val="single" w:color="BFBFBF" w:sz="4"/>
               <w:left w:val="single" w:color="BFBFBF" w:sz="4"/>
@@ -6423,7 +6361,7 @@
         </w:tc>
         <w:tc>
           <w:tcPr>
-            <w:tcW w:type="dxa" w:w="4626"/>
+            <w:tcW w:type="dxa" w:w="6026"/>
             <w:tcBorders>
               <w:top w:val="single" w:color="BFBFBF" w:sz="4"/>
               <w:left w:val="single" w:color="BFBFBF" w:sz="4"/>
@@ -6449,37 +6387,6 @@
                 <w:szCs w:val="19"/>
               </w:rPr>
               <w:t xml:space="preserve">Reconciliation and reissue of the business plan (R8) against verified numbers; a funder-ready financial model and supporting documentation</w:t>
-            </w:r>
-          </w:p>
-        </w:tc>
-        <w:tc>
-          <w:tcPr>
-            <w:tcW w:type="dxa" w:w="1800"/>
-            <w:tcBorders>
-              <w:top w:val="single" w:color="BFBFBF" w:sz="4"/>
-              <w:left w:val="single" w:color="BFBFBF" w:sz="4"/>
-              <w:bottom w:val="single" w:color="BFBFBF" w:sz="4"/>
-              <w:right w:val="single" w:color="BFBFBF" w:sz="4"/>
-            </w:tcBorders>
-            <w:shd w:fill="F7F5EF" w:color="auto" w:val="clear"/>
-            <w:tcMar>
-              <w:top w:type="dxa" w:w="70"/>
-              <w:left w:type="dxa" w:w="110"/>
-              <w:bottom w:type="dxa" w:w="70"/>
-              <w:right w:type="dxa" w:w="110"/>
-            </w:tcMar>
-          </w:tcPr>
-          <w:p>
-            <w:r>
-              <w:rPr>
-                <w:rFonts w:ascii="Open Sans" w:cs="Open Sans" w:eastAsia="Open Sans" w:hAnsi="Open Sans"/>
-                <w:b w:val="false"/>
-                <w:bCs w:val="false"/>
-                <w:color w:val="222222"/>
-                <w:sz w:val="19"/>
-                <w:szCs w:val="19"/>
-              </w:rPr>
-              <w:t xml:space="preserve">8,000 – 20,000</w:t>
             </w:r>
           </w:p>
         </w:tc>
@@ -6490,7 +6397,7 @@
         </w:trPr>
         <w:tc>
           <w:tcPr>
-            <w:tcW w:type="dxa" w:w="2600"/>
+            <w:tcW w:type="dxa" w:w="3000"/>
             <w:tcBorders>
               <w:top w:val="single" w:color="BFBFBF" w:sz="4"/>
               <w:left w:val="single" w:color="BFBFBF" w:sz="4"/>
@@ -6520,7 +6427,7 @@
         </w:tc>
         <w:tc>
           <w:tcPr>
-            <w:tcW w:type="dxa" w:w="4626"/>
+            <w:tcW w:type="dxa" w:w="6026"/>
             <w:tcBorders>
               <w:top w:val="single" w:color="BFBFBF" w:sz="4"/>
               <w:left w:val="single" w:color="BFBFBF" w:sz="4"/>
@@ -6545,36 +6452,6 @@
                 <w:szCs w:val="19"/>
               </w:rPr>
               <w:t xml:space="preserve">Outgrower supply agreements (R5); food safety and quality documentation for institutional buyers (R7); buyer engagement for schools, hospitals and prisons</w:t>
-            </w:r>
-          </w:p>
-        </w:tc>
-        <w:tc>
-          <w:tcPr>
-            <w:tcW w:type="dxa" w:w="1800"/>
-            <w:tcBorders>
-              <w:top w:val="single" w:color="BFBFBF" w:sz="4"/>
-              <w:left w:val="single" w:color="BFBFBF" w:sz="4"/>
-              <w:bottom w:val="single" w:color="BFBFBF" w:sz="4"/>
-              <w:right w:val="single" w:color="BFBFBF" w:sz="4"/>
-            </w:tcBorders>
-            <w:tcMar>
-              <w:top w:type="dxa" w:w="70"/>
-              <w:left w:type="dxa" w:w="110"/>
-              <w:bottom w:type="dxa" w:w="70"/>
-              <w:right w:type="dxa" w:w="110"/>
-            </w:tcMar>
-          </w:tcPr>
-          <w:p>
-            <w:r>
-              <w:rPr>
-                <w:rFonts w:ascii="Open Sans" w:cs="Open Sans" w:eastAsia="Open Sans" w:hAnsi="Open Sans"/>
-                <w:b w:val="false"/>
-                <w:bCs w:val="false"/>
-                <w:color w:val="222222"/>
-                <w:sz w:val="19"/>
-                <w:szCs w:val="19"/>
-              </w:rPr>
-              <w:t xml:space="preserve">15,000 – 40,000</w:t>
             </w:r>
           </w:p>
         </w:tc>

</xml_diff>

<commit_message>
Remove AVAC price ranges from the anonymised diagnostic report (#5)
Claude-Session: https://claude.ai/code/session_013F3bb4ix2DfWvuNVcmYkcc

Co-authored-by: Claude <noreply@anthropic.com>
</commit_message>
<xml_diff>
--- a/reports/oil-palm-processor-diagnostic-report-anonymised.docx
+++ b/reports/oil-palm-processor-diagnostic-report-anonymised.docx
@@ -6173,7 +6173,7 @@
           <w:sz w:val="21"/>
           <w:szCs w:val="21"/>
         </w:rPr>
-        <w:t xml:space="preserve">This pilot was provided at no charge. The work below is the paid continuation; each item is priced independently.</w:t>
+        <w:t xml:space="preserve">This pilot was provided at no charge. The work below is the paid continuation; each item is scoped and quoted separately.</w:t>
       </w:r>
     </w:p>
     <w:tbl>
@@ -6189,9 +6189,8 @@
         </w:tblBorders>
       </w:tblPr>
       <w:tblGrid>
-        <w:gridCol w:w="2600"/>
-        <w:gridCol w:w="4626"/>
-        <w:gridCol w:w="1800"/>
+        <w:gridCol w:w="3000"/>
+        <w:gridCol w:w="6026"/>
       </w:tblGrid>
       <w:tr>
         <w:trPr>
@@ -6199,7 +6198,7 @@
         </w:trPr>
         <w:tc>
           <w:tcPr>
-            <w:tcW w:type="dxa" w:w="2600"/>
+            <w:tcW w:type="dxa" w:w="3000"/>
             <w:tcBorders>
               <w:top w:val="single" w:color="BFBFBF" w:sz="4"/>
               <w:left w:val="single" w:color="BFBFBF" w:sz="4"/>
@@ -6230,7 +6229,7 @@
         </w:tc>
         <w:tc>
           <w:tcPr>
-            <w:tcW w:type="dxa" w:w="4626"/>
+            <w:tcW w:type="dxa" w:w="6026"/>
             <w:tcBorders>
               <w:top w:val="single" w:color="BFBFBF" w:sz="4"/>
               <w:left w:val="single" w:color="BFBFBF" w:sz="4"/>
@@ -6259,37 +6258,6 @@
             </w:r>
           </w:p>
         </w:tc>
-        <w:tc>
-          <w:tcPr>
-            <w:tcW w:type="dxa" w:w="1800"/>
-            <w:tcBorders>
-              <w:top w:val="single" w:color="BFBFBF" w:sz="4"/>
-              <w:left w:val="single" w:color="BFBFBF" w:sz="4"/>
-              <w:bottom w:val="single" w:color="BFBFBF" w:sz="4"/>
-              <w:right w:val="single" w:color="BFBFBF" w:sz="4"/>
-            </w:tcBorders>
-            <w:shd w:fill="1F5E3B" w:color="auto" w:val="clear"/>
-            <w:tcMar>
-              <w:top w:type="dxa" w:w="70"/>
-              <w:left w:type="dxa" w:w="110"/>
-              <w:bottom w:type="dxa" w:w="70"/>
-              <w:right w:type="dxa" w:w="110"/>
-            </w:tcMar>
-          </w:tcPr>
-          <w:p>
-            <w:r>
-              <w:rPr>
-                <w:rFonts w:ascii="Montserrat" w:cs="Montserrat" w:eastAsia="Montserrat" w:hAnsi="Montserrat"/>
-                <w:b/>
-                <w:bCs/>
-                <w:color w:val="FFFFFF"/>
-                <w:sz w:val="17"/>
-                <w:szCs w:val="17"/>
-              </w:rPr>
-              <w:t xml:space="preserve">Indicative range (GHS)</w:t>
-            </w:r>
-          </w:p>
-        </w:tc>
       </w:tr>
       <w:tr>
         <w:trPr>
@@ -6297,7 +6265,7 @@
         </w:trPr>
         <w:tc>
           <w:tcPr>
-            <w:tcW w:type="dxa" w:w="2600"/>
+            <w:tcW w:type="dxa" w:w="3000"/>
             <w:tcBorders>
               <w:top w:val="single" w:color="BFBFBF" w:sz="4"/>
               <w:left w:val="single" w:color="BFBFBF" w:sz="4"/>
@@ -6327,7 +6295,7 @@
         </w:tc>
         <w:tc>
           <w:tcPr>
-            <w:tcW w:type="dxa" w:w="4626"/>
+            <w:tcW w:type="dxa" w:w="6026"/>
             <w:tcBorders>
               <w:top w:val="single" w:color="BFBFBF" w:sz="4"/>
               <w:left w:val="single" w:color="BFBFBF" w:sz="4"/>
@@ -6352,36 +6320,6 @@
                 <w:szCs w:val="19"/>
               </w:rPr>
               <w:t xml:space="preserve">Verification of Findings 4 to 7 on site; installation of the costing system (R1), production record system (R2) and management account pack (R6); governance and role definition</w:t>
-            </w:r>
-          </w:p>
-        </w:tc>
-        <w:tc>
-          <w:tcPr>
-            <w:tcW w:type="dxa" w:w="1800"/>
-            <w:tcBorders>
-              <w:top w:val="single" w:color="BFBFBF" w:sz="4"/>
-              <w:left w:val="single" w:color="BFBFBF" w:sz="4"/>
-              <w:bottom w:val="single" w:color="BFBFBF" w:sz="4"/>
-              <w:right w:val="single" w:color="BFBFBF" w:sz="4"/>
-            </w:tcBorders>
-            <w:tcMar>
-              <w:top w:type="dxa" w:w="70"/>
-              <w:left w:type="dxa" w:w="110"/>
-              <w:bottom w:type="dxa" w:w="70"/>
-              <w:right w:type="dxa" w:w="110"/>
-            </w:tcMar>
-          </w:tcPr>
-          <w:p>
-            <w:r>
-              <w:rPr>
-                <w:rFonts w:ascii="Open Sans" w:cs="Open Sans" w:eastAsia="Open Sans" w:hAnsi="Open Sans"/>
-                <w:b w:val="false"/>
-                <w:bCs w:val="false"/>
-                <w:color w:val="222222"/>
-                <w:sz w:val="19"/>
-                <w:szCs w:val="19"/>
-              </w:rPr>
-              <w:t xml:space="preserve">12,000 – 35,000</w:t>
             </w:r>
           </w:p>
         </w:tc>
@@ -6392,7 +6330,7 @@
         </w:trPr>
         <w:tc>
           <w:tcPr>
-            <w:tcW w:type="dxa" w:w="2600"/>
+            <w:tcW w:type="dxa" w:w="3000"/>
             <w:tcBorders>
               <w:top w:val="single" w:color="BFBFBF" w:sz="4"/>
               <w:left w:val="single" w:color="BFBFBF" w:sz="4"/>
@@ -6423,7 +6361,7 @@
         </w:tc>
         <w:tc>
           <w:tcPr>
-            <w:tcW w:type="dxa" w:w="4626"/>
+            <w:tcW w:type="dxa" w:w="6026"/>
             <w:tcBorders>
               <w:top w:val="single" w:color="BFBFBF" w:sz="4"/>
               <w:left w:val="single" w:color="BFBFBF" w:sz="4"/>
@@ -6449,37 +6387,6 @@
                 <w:szCs w:val="19"/>
               </w:rPr>
               <w:t xml:space="preserve">Reconciliation and reissue of the business plan (R8) against verified numbers; a funder-ready financial model and supporting documentation</w:t>
-            </w:r>
-          </w:p>
-        </w:tc>
-        <w:tc>
-          <w:tcPr>
-            <w:tcW w:type="dxa" w:w="1800"/>
-            <w:tcBorders>
-              <w:top w:val="single" w:color="BFBFBF" w:sz="4"/>
-              <w:left w:val="single" w:color="BFBFBF" w:sz="4"/>
-              <w:bottom w:val="single" w:color="BFBFBF" w:sz="4"/>
-              <w:right w:val="single" w:color="BFBFBF" w:sz="4"/>
-            </w:tcBorders>
-            <w:shd w:fill="F7F5EF" w:color="auto" w:val="clear"/>
-            <w:tcMar>
-              <w:top w:type="dxa" w:w="70"/>
-              <w:left w:type="dxa" w:w="110"/>
-              <w:bottom w:type="dxa" w:w="70"/>
-              <w:right w:type="dxa" w:w="110"/>
-            </w:tcMar>
-          </w:tcPr>
-          <w:p>
-            <w:r>
-              <w:rPr>
-                <w:rFonts w:ascii="Open Sans" w:cs="Open Sans" w:eastAsia="Open Sans" w:hAnsi="Open Sans"/>
-                <w:b w:val="false"/>
-                <w:bCs w:val="false"/>
-                <w:color w:val="222222"/>
-                <w:sz w:val="19"/>
-                <w:szCs w:val="19"/>
-              </w:rPr>
-              <w:t xml:space="preserve">8,000 – 20,000</w:t>
             </w:r>
           </w:p>
         </w:tc>
@@ -6490,7 +6397,7 @@
         </w:trPr>
         <w:tc>
           <w:tcPr>
-            <w:tcW w:type="dxa" w:w="2600"/>
+            <w:tcW w:type="dxa" w:w="3000"/>
             <w:tcBorders>
               <w:top w:val="single" w:color="BFBFBF" w:sz="4"/>
               <w:left w:val="single" w:color="BFBFBF" w:sz="4"/>
@@ -6520,7 +6427,7 @@
         </w:tc>
         <w:tc>
           <w:tcPr>
-            <w:tcW w:type="dxa" w:w="4626"/>
+            <w:tcW w:type="dxa" w:w="6026"/>
             <w:tcBorders>
               <w:top w:val="single" w:color="BFBFBF" w:sz="4"/>
               <w:left w:val="single" w:color="BFBFBF" w:sz="4"/>
@@ -6545,36 +6452,6 @@
                 <w:szCs w:val="19"/>
               </w:rPr>
               <w:t xml:space="preserve">Outgrower supply agreements (R5); food safety and quality documentation for institutional buyers (R7); buyer engagement for schools, hospitals and prisons</w:t>
-            </w:r>
-          </w:p>
-        </w:tc>
-        <w:tc>
-          <w:tcPr>
-            <w:tcW w:type="dxa" w:w="1800"/>
-            <w:tcBorders>
-              <w:top w:val="single" w:color="BFBFBF" w:sz="4"/>
-              <w:left w:val="single" w:color="BFBFBF" w:sz="4"/>
-              <w:bottom w:val="single" w:color="BFBFBF" w:sz="4"/>
-              <w:right w:val="single" w:color="BFBFBF" w:sz="4"/>
-            </w:tcBorders>
-            <w:tcMar>
-              <w:top w:type="dxa" w:w="70"/>
-              <w:left w:type="dxa" w:w="110"/>
-              <w:bottom w:type="dxa" w:w="70"/>
-              <w:right w:type="dxa" w:w="110"/>
-            </w:tcMar>
-          </w:tcPr>
-          <w:p>
-            <w:r>
-              <w:rPr>
-                <w:rFonts w:ascii="Open Sans" w:cs="Open Sans" w:eastAsia="Open Sans" w:hAnsi="Open Sans"/>
-                <w:b w:val="false"/>
-                <w:bCs w:val="false"/>
-                <w:color w:val="222222"/>
-                <w:sz w:val="19"/>
-                <w:szCs w:val="19"/>
-              </w:rPr>
-              <w:t xml:space="preserve">15,000 – 40,000</w:t>
             </w:r>
           </w:p>
         </w:tc>

</xml_diff>